<commit_message>
updated questions and other things
</commit_message>
<xml_diff>
--- a/JAVA.docx
+++ b/JAVA.docx
@@ -17387,7 +17387,23 @@
           <w:sz w:val="20"/>
           <w:szCs w:val="20"/>
         </w:rPr>
-        <w:t>hasCode</w:t>
+        <w:t>has</w:t>
+      </w:r>
+      <w:r>
+        <w:rPr>
+          <w:b/>
+          <w:sz w:val="20"/>
+          <w:szCs w:val="20"/>
+        </w:rPr>
+        <w:t>h</w:t>
+      </w:r>
+      <w:r>
+        <w:rPr>
+          <w:b/>
+          <w:sz w:val="20"/>
+          <w:szCs w:val="20"/>
+        </w:rPr>
+        <w:t>Code</w:t>
       </w:r>
       <w:proofErr w:type="spellEnd"/>
       <w:r>
@@ -17533,6 +17549,7 @@
           <w:bCs/>
           <w:sz w:val="20"/>
           <w:szCs w:val="20"/>
+          <w:lang w:val="en-IN"/>
         </w:rPr>
       </w:pPr>
       <w:proofErr w:type="gramStart"/>
@@ -20184,6 +20201,7 @@
           <w:b/>
           <w:sz w:val="20"/>
           <w:szCs w:val="20"/>
+          <w:highlight w:val="yellow"/>
         </w:rPr>
         <w:t>Exception Handling in JAVA:</w:t>
       </w:r>
@@ -20211,7 +20229,23 @@
           <w:sz w:val="20"/>
           <w:szCs w:val="20"/>
         </w:rPr>
-        <w:t>an abnormal event that occurs during program execution and disrupts the normal flow of the program.</w:t>
+        <w:t xml:space="preserve">an </w:t>
+      </w:r>
+      <w:r>
+        <w:rPr>
+          <w:b/>
+          <w:sz w:val="20"/>
+          <w:szCs w:val="20"/>
+        </w:rPr>
+        <w:t>abnormal</w:t>
+      </w:r>
+      <w:r>
+        <w:rPr>
+          <w:bCs/>
+          <w:sz w:val="20"/>
+          <w:szCs w:val="20"/>
+        </w:rPr>
+        <w:t xml:space="preserve"> event that occurs during program execution and disrupts the normal flow of the program.</w:t>
       </w:r>
     </w:p>
     <w:p>
@@ -20241,15 +20275,15 @@
         <w:tblLook w:val="04A0" w:firstRow="1" w:lastRow="0" w:firstColumn="1" w:lastColumn="0" w:noHBand="0" w:noVBand="1"/>
       </w:tblPr>
       <w:tblGrid>
-        <w:gridCol w:w="3406"/>
+        <w:gridCol w:w="4176"/>
       </w:tblGrid>
       <w:tr>
         <w:trPr>
-          <w:trHeight w:val="2286"/>
+          <w:trHeight w:val="2376"/>
         </w:trPr>
         <w:tc>
           <w:tcPr>
-            <w:tcW w:w="3406" w:type="dxa"/>
+            <w:tcW w:w="4176" w:type="dxa"/>
           </w:tcPr>
           <w:p>
             <w:pPr>
@@ -20392,16 +20426,87 @@
                 <w:sz w:val="20"/>
                 <w:szCs w:val="20"/>
               </w:rPr>
+              <w:t xml:space="preserve">    |__</w:t>
+            </w:r>
+            <w:proofErr w:type="spellStart"/>
+            <w:r>
+              <w:rPr>
+                <w:bCs/>
+                <w:sz w:val="20"/>
+                <w:szCs w:val="20"/>
+              </w:rPr>
+              <w:t>IOException</w:t>
+            </w:r>
+            <w:proofErr w:type="spellEnd"/>
+            <w:r>
+              <w:rPr>
+                <w:bCs/>
+                <w:sz w:val="20"/>
+                <w:szCs w:val="20"/>
+              </w:rPr>
+              <w:t xml:space="preserve">    ← checked</w:t>
+            </w:r>
+          </w:p>
+          <w:p>
+            <w:pPr>
+              <w:jc w:val="both"/>
+              <w:rPr>
+                <w:bCs/>
+                <w:sz w:val="20"/>
+                <w:szCs w:val="20"/>
+              </w:rPr>
+            </w:pPr>
+            <w:r>
+              <w:rPr>
+                <w:bCs/>
+                <w:sz w:val="20"/>
+                <w:szCs w:val="20"/>
+              </w:rPr>
+              <w:t xml:space="preserve">    |__ </w:t>
+            </w:r>
+            <w:proofErr w:type="spellStart"/>
+            <w:r>
+              <w:rPr>
+                <w:bCs/>
+                <w:sz w:val="20"/>
+                <w:szCs w:val="20"/>
+              </w:rPr>
+              <w:t>SQLException</w:t>
+            </w:r>
+            <w:proofErr w:type="spellEnd"/>
+            <w:r>
+              <w:rPr>
+                <w:bCs/>
+                <w:sz w:val="20"/>
+                <w:szCs w:val="20"/>
+              </w:rPr>
+              <w:t xml:space="preserve"> ← checked</w:t>
+            </w:r>
+          </w:p>
+          <w:p>
+            <w:pPr>
+              <w:jc w:val="both"/>
+              <w:rPr>
+                <w:bCs/>
+                <w:sz w:val="20"/>
+                <w:szCs w:val="20"/>
+              </w:rPr>
+            </w:pPr>
+            <w:r>
+              <w:rPr>
+                <w:bCs/>
+                <w:sz w:val="20"/>
+                <w:szCs w:val="20"/>
+              </w:rPr>
               <w:t xml:space="preserve">    </w:t>
             </w:r>
             <w:r>
               <w:rPr>
-                <w:rFonts w:ascii="MS Gothic" w:eastAsia="MS Gothic" w:hAnsi="MS Gothic" w:cs="MS Gothic" w:hint="eastAsia"/>
-                <w:bCs/>
-                <w:sz w:val="20"/>
-                <w:szCs w:val="20"/>
-              </w:rPr>
-              <w:t>├</w:t>
+                <w:bCs/>
+                <w:sz w:val="20"/>
+                <w:szCs w:val="20"/>
+              </w:rPr>
+              <w:t>|</w:t>
             </w:r>
             <w:r>
               <w:rPr>
@@ -20430,6 +20535,14 @@
               <w:t>RuntimeException</w:t>
             </w:r>
             <w:proofErr w:type="spellEnd"/>
+            <w:r>
+              <w:rPr>
+                <w:bCs/>
+                <w:sz w:val="20"/>
+                <w:szCs w:val="20"/>
+              </w:rPr>
+              <w:t xml:space="preserve"> ← unchecked </w:t>
+            </w:r>
           </w:p>
           <w:p>
             <w:pPr>
@@ -20446,8 +20559,18 @@
                 <w:sz w:val="20"/>
                 <w:szCs w:val="20"/>
               </w:rPr>
-              <w:t xml:space="preserve">    │</w:t>
-            </w:r>
+              <w:t xml:space="preserve">          |_</w:t>
+            </w:r>
+            <w:proofErr w:type="spellStart"/>
+            <w:r>
+              <w:rPr>
+                <w:bCs/>
+                <w:sz w:val="20"/>
+                <w:szCs w:val="20"/>
+              </w:rPr>
+              <w:t>NullPointerException</w:t>
+            </w:r>
+            <w:proofErr w:type="spellEnd"/>
           </w:p>
           <w:p>
             <w:pPr>
@@ -20464,7 +20587,61 @@
                 <w:sz w:val="20"/>
                 <w:szCs w:val="20"/>
               </w:rPr>
-              <w:t xml:space="preserve">    └── Other Exceptions</w:t>
+              <w:t xml:space="preserve">          |_</w:t>
+            </w:r>
+            <w:proofErr w:type="spellStart"/>
+            <w:r>
+              <w:rPr>
+                <w:bCs/>
+                <w:sz w:val="20"/>
+                <w:szCs w:val="20"/>
+              </w:rPr>
+              <w:t>ArithmeticException</w:t>
+            </w:r>
+            <w:proofErr w:type="spellEnd"/>
+          </w:p>
+          <w:p>
+            <w:pPr>
+              <w:jc w:val="both"/>
+              <w:rPr>
+                <w:bCs/>
+                <w:sz w:val="20"/>
+                <w:szCs w:val="20"/>
+              </w:rPr>
+            </w:pPr>
+            <w:r>
+              <w:rPr>
+                <w:bCs/>
+                <w:sz w:val="20"/>
+                <w:szCs w:val="20"/>
+              </w:rPr>
+              <w:t xml:space="preserve">          |_</w:t>
+            </w:r>
+            <w:proofErr w:type="spellStart"/>
+            <w:r>
+              <w:rPr>
+                <w:bCs/>
+                <w:sz w:val="20"/>
+                <w:szCs w:val="20"/>
+              </w:rPr>
+              <w:t>ArrayIndexOutOfBooundExecption</w:t>
+            </w:r>
+            <w:proofErr w:type="spellEnd"/>
+            <w:r>
+              <w:rPr>
+                <w:bCs/>
+                <w:sz w:val="20"/>
+                <w:szCs w:val="20"/>
+              </w:rPr>
+              <w:t xml:space="preserve"> </w:t>
+            </w:r>
+            <w:r>
+              <w:rPr>
+                <w:bCs/>
+                <w:sz w:val="20"/>
+                <w:szCs w:val="20"/>
+              </w:rPr>
+              <w:t xml:space="preserve"> </w:t>
             </w:r>
           </w:p>
         </w:tc>
@@ -20505,6 +20682,14 @@
         </w:rPr>
         <w:t>Error: Serious problem that application usually can’t handle.</w:t>
       </w:r>
+      <w:r>
+        <w:rPr>
+          <w:bCs/>
+          <w:sz w:val="20"/>
+          <w:szCs w:val="20"/>
+        </w:rPr>
+        <w:t xml:space="preserve"> Serious JVM or system problem</w:t>
+      </w:r>
     </w:p>
     <w:p>
       <w:pPr>
@@ -20531,6 +20716,14 @@
           <w:sz w:val="20"/>
           <w:szCs w:val="20"/>
         </w:rPr>
+        <w:t>,</w:t>
+      </w:r>
+      <w:r>
+        <w:rPr>
+          <w:bCs/>
+          <w:sz w:val="20"/>
+          <w:szCs w:val="20"/>
+        </w:rPr>
         <w:t xml:space="preserve"> </w:t>
       </w:r>
       <w:proofErr w:type="spellStart"/>
@@ -20566,14 +20759,14 @@
       <w:pPr>
         <w:jc w:val="both"/>
         <w:rPr>
-          <w:bCs/>
-          <w:sz w:val="20"/>
-          <w:szCs w:val="20"/>
-        </w:rPr>
-      </w:pPr>
-      <w:r>
-        <w:rPr>
-          <w:bCs/>
+          <w:b/>
+          <w:sz w:val="20"/>
+          <w:szCs w:val="20"/>
+        </w:rPr>
+      </w:pPr>
+      <w:r>
+        <w:rPr>
+          <w:b/>
           <w:sz w:val="20"/>
           <w:szCs w:val="20"/>
         </w:rPr>
@@ -20581,6 +20774,14 @@
       </w:r>
     </w:p>
     <w:p>
+      <w:r>
+        <w:rPr>
+          <w:highlight w:val="cyan"/>
+        </w:rPr>
+        <w:t>Compiler checks them at compile time.</w:t>
+      </w:r>
+    </w:p>
+    <w:p>
       <w:pPr>
         <w:jc w:val="both"/>
         <w:rPr>
@@ -20589,14 +20790,16 @@
           <w:szCs w:val="20"/>
         </w:rPr>
       </w:pPr>
-      <w:r>
-        <w:rPr>
-          <w:bCs/>
-          <w:sz w:val="20"/>
-          <w:szCs w:val="20"/>
-        </w:rPr>
-        <w:t>Compiler checks them at compile time.</w:t>
-      </w:r>
+      <w:proofErr w:type="spellStart"/>
+      <w:r>
+        <w:rPr>
+          <w:bCs/>
+          <w:sz w:val="20"/>
+          <w:szCs w:val="20"/>
+        </w:rPr>
+        <w:t>IOException</w:t>
+      </w:r>
+      <w:proofErr w:type="spellEnd"/>
     </w:p>
     <w:p>
       <w:pPr>
@@ -20614,7 +20817,8 @@
           <w:sz w:val="20"/>
           <w:szCs w:val="20"/>
         </w:rPr>
-        <w:t>IOException</w:t>
+        <w:lastRenderedPageBreak/>
+        <w:t>SQLException</w:t>
       </w:r>
       <w:proofErr w:type="spellEnd"/>
     </w:p>
@@ -20634,7 +20838,7 @@
           <w:sz w:val="20"/>
           <w:szCs w:val="20"/>
         </w:rPr>
-        <w:t>SQLException</w:t>
+        <w:t>FileNotFoundException</w:t>
       </w:r>
       <w:proofErr w:type="spellEnd"/>
     </w:p>
@@ -20647,33 +20851,12 @@
           <w:szCs w:val="20"/>
         </w:rPr>
       </w:pPr>
-      <w:proofErr w:type="spellStart"/>
-      <w:r>
-        <w:rPr>
-          <w:bCs/>
-          <w:sz w:val="20"/>
-          <w:szCs w:val="20"/>
-        </w:rPr>
-        <w:t>FileNotFoundException</w:t>
-      </w:r>
-      <w:proofErr w:type="spellEnd"/>
-    </w:p>
-    <w:p>
-      <w:pPr>
-        <w:jc w:val="both"/>
-        <w:rPr>
-          <w:bCs/>
-          <w:sz w:val="20"/>
-          <w:szCs w:val="20"/>
-        </w:rPr>
-      </w:pPr>
-      <w:r>
-        <w:rPr>
-          <w:bCs/>
-          <w:sz w:val="20"/>
-          <w:szCs w:val="20"/>
-        </w:rPr>
-        <w:lastRenderedPageBreak/>
+      <w:r>
+        <w:rPr>
+          <w:bCs/>
+          <w:sz w:val="20"/>
+          <w:szCs w:val="20"/>
+        </w:rPr>
         <w:t>handle them with try-catch or declare them using throws.</w:t>
       </w:r>
     </w:p>
@@ -21681,6 +21864,7 @@
           <w:sz w:val="20"/>
           <w:szCs w:val="20"/>
         </w:rPr>
+        <w:lastRenderedPageBreak/>
         <w:t xml:space="preserve">void </w:t>
       </w:r>
       <w:proofErr w:type="spellStart"/>
@@ -21763,7 +21947,6 @@
           <w:sz w:val="20"/>
           <w:szCs w:val="20"/>
         </w:rPr>
-        <w:lastRenderedPageBreak/>
         <w:t>Custom Exception:</w:t>
       </w:r>
     </w:p>
@@ -22372,6 +22555,7 @@
                 <w:bCs/>
                 <w:sz w:val="20"/>
                 <w:szCs w:val="20"/>
+                <w:highlight w:val="cyan"/>
               </w:rPr>
               <w:t>Automatic resource closing.</w:t>
             </w:r>
@@ -22388,6 +22572,965 @@
           <w:szCs w:val="20"/>
         </w:rPr>
       </w:pPr>
+      <w:r>
+        <w:rPr>
+          <w:bCs/>
+          <w:sz w:val="20"/>
+          <w:szCs w:val="20"/>
+        </w:rPr>
+        <w:t xml:space="preserve">If any exception left unhandled the </w:t>
+      </w:r>
+      <w:proofErr w:type="spellStart"/>
+      <w:r>
+        <w:rPr>
+          <w:bCs/>
+          <w:sz w:val="20"/>
+          <w:szCs w:val="20"/>
+        </w:rPr>
+        <w:t>jvm</w:t>
+      </w:r>
+      <w:proofErr w:type="spellEnd"/>
+      <w:r>
+        <w:rPr>
+          <w:bCs/>
+          <w:sz w:val="20"/>
+          <w:szCs w:val="20"/>
+        </w:rPr>
+        <w:t xml:space="preserve"> uncaught exception handling mechanism terminates the program.</w:t>
+      </w:r>
+    </w:p>
+    <w:p>
+      <w:pPr>
+        <w:jc w:val="both"/>
+        <w:rPr>
+          <w:bCs/>
+          <w:sz w:val="20"/>
+          <w:szCs w:val="20"/>
+        </w:rPr>
+      </w:pPr>
+      <w:r>
+        <w:rPr>
+          <w:bCs/>
+          <w:sz w:val="20"/>
+          <w:szCs w:val="20"/>
+        </w:rPr>
+        <w:t xml:space="preserve">If exception is not handled in particular </w:t>
+      </w:r>
+      <w:proofErr w:type="gramStart"/>
+      <w:r>
+        <w:rPr>
+          <w:bCs/>
+          <w:sz w:val="20"/>
+          <w:szCs w:val="20"/>
+        </w:rPr>
+        <w:t>method</w:t>
+      </w:r>
+      <w:proofErr w:type="gramEnd"/>
+      <w:r>
+        <w:rPr>
+          <w:bCs/>
+          <w:sz w:val="20"/>
+          <w:szCs w:val="20"/>
+        </w:rPr>
+        <w:t xml:space="preserve"> then it moves to the calling method this is called exception propagation.</w:t>
+      </w:r>
+    </w:p>
+    <w:p>
+      <w:pPr>
+        <w:jc w:val="both"/>
+        <w:rPr>
+          <w:bCs/>
+          <w:sz w:val="20"/>
+          <w:szCs w:val="20"/>
+        </w:rPr>
+      </w:pPr>
+      <w:r>
+        <w:rPr>
+          <w:b/>
+          <w:sz w:val="20"/>
+          <w:szCs w:val="20"/>
+        </w:rPr>
+        <w:t xml:space="preserve">Exception in method </w:t>
+      </w:r>
+      <w:proofErr w:type="gramStart"/>
+      <w:r>
+        <w:rPr>
+          <w:b/>
+          <w:sz w:val="20"/>
+          <w:szCs w:val="20"/>
+        </w:rPr>
+        <w:t xml:space="preserve">overriding </w:t>
+      </w:r>
+      <w:r>
+        <w:rPr>
+          <w:b/>
+          <w:sz w:val="20"/>
+          <w:szCs w:val="20"/>
+        </w:rPr>
+        <w:t>:</w:t>
+      </w:r>
+      <w:proofErr w:type="gramEnd"/>
+      <w:r>
+        <w:rPr>
+          <w:b/>
+          <w:sz w:val="20"/>
+          <w:szCs w:val="20"/>
+        </w:rPr>
+        <w:t xml:space="preserve"> </w:t>
+      </w:r>
+      <w:r>
+        <w:rPr>
+          <w:bCs/>
+          <w:sz w:val="20"/>
+          <w:szCs w:val="20"/>
+        </w:rPr>
+        <w:t>a child class can’t throw a broader exception.</w:t>
+      </w:r>
+    </w:p>
+    <w:p>
+      <w:pPr>
+        <w:jc w:val="both"/>
+        <w:rPr>
+          <w:bCs/>
+          <w:sz w:val="20"/>
+          <w:szCs w:val="20"/>
+        </w:rPr>
+      </w:pPr>
+      <w:r>
+        <w:rPr>
+          <w:bCs/>
+          <w:sz w:val="20"/>
+          <w:szCs w:val="20"/>
+        </w:rPr>
+        <w:t xml:space="preserve">Eg: </w:t>
+      </w:r>
+      <w:r>
+        <w:rPr>
+          <w:bCs/>
+          <w:sz w:val="20"/>
+          <w:szCs w:val="20"/>
+        </w:rPr>
+        <w:tab/>
+      </w:r>
+    </w:p>
+    <w:tbl>
+      <w:tblPr>
+        <w:tblStyle w:val="TableGrid"/>
+        <w:tblW w:w="0" w:type="auto"/>
+        <w:tblLook w:val="04A0" w:firstRow="1" w:lastRow="0" w:firstColumn="1" w:lastColumn="0" w:noHBand="0" w:noVBand="1"/>
+      </w:tblPr>
+      <w:tblGrid>
+        <w:gridCol w:w="5971"/>
+        <w:gridCol w:w="5971"/>
+      </w:tblGrid>
+      <w:tr>
+        <w:tc>
+          <w:tcPr>
+            <w:tcW w:w="5971" w:type="dxa"/>
+          </w:tcPr>
+          <w:p>
+            <w:pPr>
+              <w:jc w:val="both"/>
+              <w:rPr>
+                <w:bCs/>
+                <w:sz w:val="20"/>
+                <w:szCs w:val="20"/>
+              </w:rPr>
+            </w:pPr>
+            <w:r>
+              <w:rPr>
+                <w:bCs/>
+                <w:sz w:val="20"/>
+                <w:szCs w:val="20"/>
+              </w:rPr>
+              <w:t>class Parent {</w:t>
+            </w:r>
+          </w:p>
+          <w:p>
+            <w:pPr>
+              <w:jc w:val="both"/>
+              <w:rPr>
+                <w:bCs/>
+                <w:sz w:val="20"/>
+                <w:szCs w:val="20"/>
+              </w:rPr>
+            </w:pPr>
+            <w:r>
+              <w:rPr>
+                <w:bCs/>
+                <w:sz w:val="20"/>
+                <w:szCs w:val="20"/>
+              </w:rPr>
+              <w:t xml:space="preserve">    void </w:t>
+            </w:r>
+            <w:proofErr w:type="gramStart"/>
+            <w:r>
+              <w:rPr>
+                <w:bCs/>
+                <w:sz w:val="20"/>
+                <w:szCs w:val="20"/>
+              </w:rPr>
+              <w:t>show(</w:t>
+            </w:r>
+            <w:proofErr w:type="gramEnd"/>
+            <w:r>
+              <w:rPr>
+                <w:bCs/>
+                <w:sz w:val="20"/>
+                <w:szCs w:val="20"/>
+              </w:rPr>
+              <w:t xml:space="preserve">) throws </w:t>
+            </w:r>
+            <w:proofErr w:type="spellStart"/>
+            <w:r>
+              <w:rPr>
+                <w:bCs/>
+                <w:sz w:val="20"/>
+                <w:szCs w:val="20"/>
+              </w:rPr>
+              <w:t>IOException</w:t>
+            </w:r>
+            <w:proofErr w:type="spellEnd"/>
+            <w:r>
+              <w:rPr>
+                <w:bCs/>
+                <w:sz w:val="20"/>
+                <w:szCs w:val="20"/>
+              </w:rPr>
+              <w:t xml:space="preserve"> {}</w:t>
+            </w:r>
+          </w:p>
+          <w:p>
+            <w:pPr>
+              <w:jc w:val="both"/>
+              <w:rPr>
+                <w:bCs/>
+                <w:sz w:val="20"/>
+                <w:szCs w:val="20"/>
+              </w:rPr>
+            </w:pPr>
+            <w:r>
+              <w:rPr>
+                <w:bCs/>
+                <w:sz w:val="20"/>
+                <w:szCs w:val="20"/>
+              </w:rPr>
+              <w:t>}</w:t>
+            </w:r>
+          </w:p>
+          <w:p>
+            <w:pPr>
+              <w:jc w:val="both"/>
+              <w:rPr>
+                <w:bCs/>
+                <w:sz w:val="20"/>
+                <w:szCs w:val="20"/>
+              </w:rPr>
+            </w:pPr>
+            <w:r>
+              <w:rPr>
+                <w:bCs/>
+                <w:sz w:val="20"/>
+                <w:szCs w:val="20"/>
+              </w:rPr>
+              <w:t>class Child extends Parent {</w:t>
+            </w:r>
+          </w:p>
+          <w:p>
+            <w:pPr>
+              <w:jc w:val="both"/>
+              <w:rPr>
+                <w:bCs/>
+                <w:sz w:val="20"/>
+                <w:szCs w:val="20"/>
+              </w:rPr>
+            </w:pPr>
+            <w:r>
+              <w:rPr>
+                <w:bCs/>
+                <w:sz w:val="20"/>
+                <w:szCs w:val="20"/>
+              </w:rPr>
+              <w:t xml:space="preserve">    void </w:t>
+            </w:r>
+            <w:proofErr w:type="gramStart"/>
+            <w:r>
+              <w:rPr>
+                <w:bCs/>
+                <w:sz w:val="20"/>
+                <w:szCs w:val="20"/>
+              </w:rPr>
+              <w:t>show(</w:t>
+            </w:r>
+            <w:proofErr w:type="gramEnd"/>
+            <w:r>
+              <w:rPr>
+                <w:bCs/>
+                <w:sz w:val="20"/>
+                <w:szCs w:val="20"/>
+              </w:rPr>
+              <w:t xml:space="preserve">) throws </w:t>
+            </w:r>
+            <w:proofErr w:type="spellStart"/>
+            <w:r>
+              <w:rPr>
+                <w:bCs/>
+                <w:sz w:val="20"/>
+                <w:szCs w:val="20"/>
+              </w:rPr>
+              <w:t>FileNotFoundException</w:t>
+            </w:r>
+            <w:proofErr w:type="spellEnd"/>
+            <w:r>
+              <w:rPr>
+                <w:bCs/>
+                <w:sz w:val="20"/>
+                <w:szCs w:val="20"/>
+              </w:rPr>
+              <w:t xml:space="preserve"> {} // </w:t>
+            </w:r>
+            <w:r>
+              <w:rPr>
+                <w:rFonts w:ascii="Segoe UI Emoji" w:hAnsi="Segoe UI Emoji" w:cs="Segoe UI Emoji"/>
+                <w:bCs/>
+                <w:sz w:val="20"/>
+                <w:szCs w:val="20"/>
+              </w:rPr>
+              <w:t>✅</w:t>
+            </w:r>
+          </w:p>
+          <w:p>
+            <w:pPr>
+              <w:jc w:val="both"/>
+              <w:rPr>
+                <w:bCs/>
+                <w:sz w:val="20"/>
+                <w:szCs w:val="20"/>
+              </w:rPr>
+            </w:pPr>
+            <w:r>
+              <w:rPr>
+                <w:bCs/>
+                <w:sz w:val="20"/>
+                <w:szCs w:val="20"/>
+              </w:rPr>
+              <w:t>}</w:t>
+            </w:r>
+          </w:p>
+        </w:tc>
+        <w:tc>
+          <w:tcPr>
+            <w:tcW w:w="5971" w:type="dxa"/>
+          </w:tcPr>
+          <w:p>
+            <w:pPr>
+              <w:jc w:val="both"/>
+              <w:rPr>
+                <w:bCs/>
+                <w:sz w:val="20"/>
+                <w:szCs w:val="20"/>
+              </w:rPr>
+            </w:pPr>
+            <w:r>
+              <w:rPr>
+                <w:bCs/>
+                <w:sz w:val="20"/>
+                <w:szCs w:val="20"/>
+              </w:rPr>
+              <w:t>class Child extends Parent {</w:t>
+            </w:r>
+          </w:p>
+          <w:p>
+            <w:pPr>
+              <w:jc w:val="both"/>
+              <w:rPr>
+                <w:bCs/>
+                <w:sz w:val="20"/>
+                <w:szCs w:val="20"/>
+              </w:rPr>
+            </w:pPr>
+            <w:r>
+              <w:rPr>
+                <w:bCs/>
+                <w:sz w:val="20"/>
+                <w:szCs w:val="20"/>
+              </w:rPr>
+              <w:t xml:space="preserve">    void </w:t>
+            </w:r>
+            <w:proofErr w:type="gramStart"/>
+            <w:r>
+              <w:rPr>
+                <w:bCs/>
+                <w:sz w:val="20"/>
+                <w:szCs w:val="20"/>
+              </w:rPr>
+              <w:t>show(</w:t>
+            </w:r>
+            <w:proofErr w:type="gramEnd"/>
+            <w:r>
+              <w:rPr>
+                <w:bCs/>
+                <w:sz w:val="20"/>
+                <w:szCs w:val="20"/>
+              </w:rPr>
+              <w:t xml:space="preserve">) throws Exception {} // </w:t>
+            </w:r>
+            <w:r>
+              <w:rPr>
+                <w:rFonts w:ascii="Segoe UI Emoji" w:hAnsi="Segoe UI Emoji" w:cs="Segoe UI Emoji"/>
+                <w:bCs/>
+                <w:sz w:val="20"/>
+                <w:szCs w:val="20"/>
+              </w:rPr>
+              <w:t>❌</w:t>
+            </w:r>
+          </w:p>
+          <w:p>
+            <w:pPr>
+              <w:jc w:val="both"/>
+              <w:rPr>
+                <w:bCs/>
+                <w:sz w:val="20"/>
+                <w:szCs w:val="20"/>
+              </w:rPr>
+            </w:pPr>
+            <w:r>
+              <w:rPr>
+                <w:bCs/>
+                <w:sz w:val="20"/>
+                <w:szCs w:val="20"/>
+              </w:rPr>
+              <w:t>}</w:t>
+            </w:r>
+          </w:p>
+          <w:p>
+            <w:pPr>
+              <w:jc w:val="both"/>
+              <w:rPr>
+                <w:bCs/>
+                <w:sz w:val="20"/>
+                <w:szCs w:val="20"/>
+              </w:rPr>
+            </w:pPr>
+          </w:p>
+          <w:p>
+            <w:pPr>
+              <w:jc w:val="both"/>
+              <w:rPr>
+                <w:bCs/>
+                <w:sz w:val="20"/>
+                <w:szCs w:val="20"/>
+              </w:rPr>
+            </w:pPr>
+            <w:r>
+              <w:rPr>
+                <w:bCs/>
+                <w:sz w:val="20"/>
+                <w:szCs w:val="20"/>
+              </w:rPr>
+              <w:t xml:space="preserve">→ unchecked exceptions </w:t>
+            </w:r>
+            <w:proofErr w:type="gramStart"/>
+            <w:r>
+              <w:rPr>
+                <w:bCs/>
+                <w:sz w:val="20"/>
+                <w:szCs w:val="20"/>
+              </w:rPr>
+              <w:t>does</w:t>
+            </w:r>
+            <w:proofErr w:type="gramEnd"/>
+            <w:r>
+              <w:rPr>
+                <w:bCs/>
+                <w:sz w:val="20"/>
+                <w:szCs w:val="20"/>
+              </w:rPr>
+              <w:t xml:space="preserve"> not have this restriction </w:t>
+            </w:r>
+          </w:p>
+        </w:tc>
+      </w:tr>
+    </w:tbl>
+    <w:p>
+      <w:pPr>
+        <w:jc w:val="both"/>
+        <w:rPr>
+          <w:b/>
+          <w:sz w:val="20"/>
+          <w:szCs w:val="20"/>
+        </w:rPr>
+      </w:pPr>
+      <w:r>
+        <w:rPr>
+          <w:b/>
+          <w:sz w:val="20"/>
+          <w:szCs w:val="20"/>
+        </w:rPr>
+        <w:t>Handling multiple exception types in single catch</w:t>
+      </w:r>
+      <w:r>
+        <w:rPr>
+          <w:b/>
+          <w:sz w:val="20"/>
+          <w:szCs w:val="20"/>
+        </w:rPr>
+        <w:t>:</w:t>
+      </w:r>
+    </w:p>
+    <w:p>
+      <w:pPr>
+        <w:jc w:val="both"/>
+        <w:rPr>
+          <w:bCs/>
+          <w:sz w:val="20"/>
+          <w:szCs w:val="20"/>
+        </w:rPr>
+      </w:pPr>
+      <w:r>
+        <w:rPr>
+          <w:bCs/>
+          <w:sz w:val="20"/>
+          <w:szCs w:val="20"/>
+        </w:rPr>
+        <w:t>catch (</w:t>
+      </w:r>
+      <w:proofErr w:type="spellStart"/>
+      <w:r>
+        <w:rPr>
+          <w:bCs/>
+          <w:sz w:val="20"/>
+          <w:szCs w:val="20"/>
+        </w:rPr>
+        <w:t>IOException</w:t>
+      </w:r>
+      <w:proofErr w:type="spellEnd"/>
+      <w:r>
+        <w:rPr>
+          <w:bCs/>
+          <w:sz w:val="20"/>
+          <w:szCs w:val="20"/>
+        </w:rPr>
+        <w:t xml:space="preserve"> | </w:t>
+      </w:r>
+      <w:proofErr w:type="spellStart"/>
+      <w:r>
+        <w:rPr>
+          <w:bCs/>
+          <w:sz w:val="20"/>
+          <w:szCs w:val="20"/>
+        </w:rPr>
+        <w:t>SQLException</w:t>
+      </w:r>
+      <w:proofErr w:type="spellEnd"/>
+      <w:r>
+        <w:rPr>
+          <w:bCs/>
+          <w:sz w:val="20"/>
+          <w:szCs w:val="20"/>
+        </w:rPr>
+        <w:t xml:space="preserve"> e) </w:t>
+      </w:r>
+      <w:proofErr w:type="gramStart"/>
+      <w:r>
+        <w:rPr>
+          <w:bCs/>
+          <w:sz w:val="20"/>
+          <w:szCs w:val="20"/>
+        </w:rPr>
+        <w:t xml:space="preserve">{ </w:t>
+      </w:r>
+      <w:proofErr w:type="spellStart"/>
+      <w:r>
+        <w:rPr>
+          <w:bCs/>
+          <w:sz w:val="20"/>
+          <w:szCs w:val="20"/>
+        </w:rPr>
+        <w:t>System.out.println</w:t>
+      </w:r>
+      <w:proofErr w:type="spellEnd"/>
+      <w:proofErr w:type="gramEnd"/>
+      <w:r>
+        <w:rPr>
+          <w:bCs/>
+          <w:sz w:val="20"/>
+          <w:szCs w:val="20"/>
+        </w:rPr>
+        <w:t>(</w:t>
+      </w:r>
+      <w:proofErr w:type="spellStart"/>
+      <w:proofErr w:type="gramStart"/>
+      <w:r>
+        <w:rPr>
+          <w:bCs/>
+          <w:sz w:val="20"/>
+          <w:szCs w:val="20"/>
+        </w:rPr>
+        <w:t>e.getMessage</w:t>
+      </w:r>
+      <w:proofErr w:type="spellEnd"/>
+      <w:proofErr w:type="gramEnd"/>
+      <w:r>
+        <w:rPr>
+          <w:bCs/>
+          <w:sz w:val="20"/>
+          <w:szCs w:val="20"/>
+        </w:rPr>
+        <w:t>())</w:t>
+      </w:r>
+      <w:proofErr w:type="gramStart"/>
+      <w:r>
+        <w:rPr>
+          <w:bCs/>
+          <w:sz w:val="20"/>
+          <w:szCs w:val="20"/>
+        </w:rPr>
+        <w:t>; }</w:t>
+      </w:r>
+      <w:proofErr w:type="gramEnd"/>
+    </w:p>
+    <w:p>
+      <w:pPr>
+        <w:jc w:val="both"/>
+        <w:rPr>
+          <w:bCs/>
+          <w:sz w:val="20"/>
+          <w:szCs w:val="20"/>
+        </w:rPr>
+      </w:pPr>
+      <w:r>
+        <w:rPr>
+          <w:bCs/>
+          <w:sz w:val="20"/>
+          <w:szCs w:val="20"/>
+        </w:rPr>
+        <w:t>Useful when handling logic is the same.</w:t>
+      </w:r>
+    </w:p>
+    <w:p>
+      <w:pPr>
+        <w:jc w:val="both"/>
+        <w:rPr>
+          <w:bCs/>
+          <w:sz w:val="20"/>
+          <w:szCs w:val="20"/>
+        </w:rPr>
+      </w:pPr>
+      <w:r>
+        <w:rPr>
+          <w:bCs/>
+          <w:sz w:val="20"/>
+          <w:szCs w:val="20"/>
+        </w:rPr>
+        <w:t xml:space="preserve">We can use nested try catch means try catch inside try </w:t>
+      </w:r>
+      <w:r>
+        <w:rPr>
+          <w:bCs/>
+          <w:sz w:val="20"/>
+          <w:szCs w:val="20"/>
+        </w:rPr>
+        <w:tab/>
+      </w:r>
+    </w:p>
+    <w:p>
+      <w:pPr>
+        <w:jc w:val="both"/>
+        <w:rPr>
+          <w:bCs/>
+          <w:sz w:val="20"/>
+          <w:szCs w:val="20"/>
+        </w:rPr>
+      </w:pPr>
+      <w:proofErr w:type="spellStart"/>
+      <w:proofErr w:type="gramStart"/>
+      <w:r>
+        <w:rPr>
+          <w:bCs/>
+          <w:sz w:val="20"/>
+          <w:szCs w:val="20"/>
+        </w:rPr>
+        <w:t>e.getMessage</w:t>
+      </w:r>
+      <w:proofErr w:type="spellEnd"/>
+      <w:proofErr w:type="gramEnd"/>
+      <w:r>
+        <w:rPr>
+          <w:bCs/>
+          <w:sz w:val="20"/>
+          <w:szCs w:val="20"/>
+        </w:rPr>
+        <w:t>() -&gt;returns only exception message //</w:t>
+      </w:r>
+      <w:r>
+        <w:t xml:space="preserve"> </w:t>
+      </w:r>
+      <w:r>
+        <w:rPr>
+          <w:bCs/>
+          <w:sz w:val="20"/>
+          <w:szCs w:val="20"/>
+        </w:rPr>
+        <w:t>"Cannot divide by zero"</w:t>
+      </w:r>
+    </w:p>
+    <w:p>
+      <w:pPr>
+        <w:jc w:val="both"/>
+        <w:rPr>
+          <w:bCs/>
+          <w:sz w:val="20"/>
+          <w:szCs w:val="20"/>
+        </w:rPr>
+      </w:pPr>
+      <w:proofErr w:type="spellStart"/>
+      <w:proofErr w:type="gramStart"/>
+      <w:r>
+        <w:rPr>
+          <w:bCs/>
+          <w:sz w:val="20"/>
+          <w:szCs w:val="20"/>
+        </w:rPr>
+        <w:t>e.tosTring</w:t>
+      </w:r>
+      <w:proofErr w:type="spellEnd"/>
+      <w:proofErr w:type="gramEnd"/>
+      <w:r>
+        <w:rPr>
+          <w:bCs/>
+          <w:sz w:val="20"/>
+          <w:szCs w:val="20"/>
+        </w:rPr>
+        <w:t xml:space="preserve">() -&gt; class+ message // </w:t>
+      </w:r>
+      <w:proofErr w:type="spellStart"/>
+      <w:proofErr w:type="gramStart"/>
+      <w:r>
+        <w:rPr>
+          <w:bCs/>
+          <w:sz w:val="20"/>
+          <w:szCs w:val="20"/>
+        </w:rPr>
+        <w:t>java.lang</w:t>
+      </w:r>
+      <w:proofErr w:type="gramEnd"/>
+      <w:r>
+        <w:rPr>
+          <w:bCs/>
+          <w:sz w:val="20"/>
+          <w:szCs w:val="20"/>
+        </w:rPr>
+        <w:t>.ArithmeticException</w:t>
+      </w:r>
+      <w:proofErr w:type="spellEnd"/>
+      <w:r>
+        <w:rPr>
+          <w:bCs/>
+          <w:sz w:val="20"/>
+          <w:szCs w:val="20"/>
+        </w:rPr>
+        <w:t>: Cannot divide by zero</w:t>
+      </w:r>
+    </w:p>
+    <w:p>
+      <w:pPr>
+        <w:jc w:val="both"/>
+        <w:rPr>
+          <w:bCs/>
+          <w:sz w:val="20"/>
+          <w:szCs w:val="20"/>
+        </w:rPr>
+      </w:pPr>
+      <w:proofErr w:type="spellStart"/>
+      <w:proofErr w:type="gramStart"/>
+      <w:r>
+        <w:rPr>
+          <w:bCs/>
+          <w:sz w:val="20"/>
+          <w:szCs w:val="20"/>
+        </w:rPr>
+        <w:t>e.printStack</w:t>
+      </w:r>
+      <w:proofErr w:type="spellEnd"/>
+      <w:proofErr w:type="gramEnd"/>
+      <w:r>
+        <w:rPr>
+          <w:bCs/>
+          <w:sz w:val="20"/>
+          <w:szCs w:val="20"/>
+        </w:rPr>
+        <w:t xml:space="preserve">() -&gt; </w:t>
+      </w:r>
+      <w:r>
+        <w:rPr>
+          <w:bCs/>
+          <w:sz w:val="20"/>
+          <w:szCs w:val="20"/>
+        </w:rPr>
+        <w:t xml:space="preserve">Prints the </w:t>
+      </w:r>
+      <w:r>
+        <w:rPr>
+          <w:b/>
+          <w:bCs/>
+          <w:sz w:val="20"/>
+          <w:szCs w:val="20"/>
+        </w:rPr>
+        <w:t>complete stack trace</w:t>
+      </w:r>
+      <w:r>
+        <w:rPr>
+          <w:bCs/>
+          <w:sz w:val="20"/>
+          <w:szCs w:val="20"/>
+        </w:rPr>
+        <w:t>, including where the exception occurred.</w:t>
+      </w:r>
+    </w:p>
+    <w:p>
+      <w:pPr>
+        <w:jc w:val="both"/>
+        <w:rPr>
+          <w:bCs/>
+          <w:sz w:val="20"/>
+          <w:szCs w:val="20"/>
+        </w:rPr>
+      </w:pPr>
+      <w:r>
+        <w:rPr>
+          <w:bCs/>
+          <w:sz w:val="20"/>
+          <w:szCs w:val="20"/>
+        </w:rPr>
+        <w:t xml:space="preserve">The finally return </w:t>
+      </w:r>
+      <w:r>
+        <w:rPr>
+          <w:b/>
+          <w:bCs/>
+          <w:sz w:val="20"/>
+          <w:szCs w:val="20"/>
+        </w:rPr>
+        <w:t>overrides</w:t>
+      </w:r>
+      <w:r>
+        <w:rPr>
+          <w:bCs/>
+          <w:sz w:val="20"/>
+          <w:szCs w:val="20"/>
+        </w:rPr>
+        <w:t xml:space="preserve"> the previous return.</w:t>
+      </w:r>
+    </w:p>
+    <w:p>
+      <w:pPr>
+        <w:jc w:val="both"/>
+        <w:rPr>
+          <w:bCs/>
+          <w:sz w:val="20"/>
+          <w:szCs w:val="20"/>
+        </w:rPr>
+      </w:pPr>
+      <w:proofErr w:type="spellStart"/>
+      <w:proofErr w:type="gramStart"/>
+      <w:r>
+        <w:rPr>
+          <w:bCs/>
+          <w:sz w:val="20"/>
+          <w:szCs w:val="20"/>
+        </w:rPr>
+        <w:t>e.getSuppressed</w:t>
+      </w:r>
+      <w:proofErr w:type="spellEnd"/>
+      <w:proofErr w:type="gramEnd"/>
+      <w:r>
+        <w:rPr>
+          <w:bCs/>
+          <w:sz w:val="20"/>
+          <w:szCs w:val="20"/>
+        </w:rPr>
+        <w:t>();</w:t>
+      </w:r>
+      <w:r>
+        <w:rPr>
+          <w:bCs/>
+          <w:sz w:val="20"/>
+          <w:szCs w:val="20"/>
+        </w:rPr>
+        <w:t xml:space="preserve"> -&gt; </w:t>
+      </w:r>
+      <w:r>
+        <w:rPr>
+          <w:bCs/>
+          <w:sz w:val="20"/>
+          <w:szCs w:val="20"/>
+        </w:rPr>
+        <w:t xml:space="preserve">Sometimes the main code throws one exception and </w:t>
+      </w:r>
+      <w:proofErr w:type="gramStart"/>
+      <w:r>
+        <w:rPr>
+          <w:bCs/>
+          <w:sz w:val="20"/>
+          <w:szCs w:val="20"/>
+        </w:rPr>
+        <w:t>close(</w:t>
+      </w:r>
+      <w:proofErr w:type="gramEnd"/>
+      <w:r>
+        <w:rPr>
+          <w:bCs/>
+          <w:sz w:val="20"/>
+          <w:szCs w:val="20"/>
+        </w:rPr>
+        <w:t>) also throws another.</w:t>
+      </w:r>
+      <w:r>
+        <w:rPr>
+          <w:bCs/>
+          <w:sz w:val="20"/>
+          <w:szCs w:val="20"/>
+        </w:rPr>
+        <w:t xml:space="preserve"> This exception is kept as Suppressed Exception.</w:t>
+      </w:r>
+    </w:p>
+    <w:p>
+      <w:pPr>
+        <w:jc w:val="both"/>
+        <w:rPr>
+          <w:bCs/>
+          <w:sz w:val="20"/>
+          <w:szCs w:val="20"/>
+        </w:rPr>
+      </w:pPr>
+      <w:r>
+        <w:rPr>
+          <w:bCs/>
+          <w:sz w:val="20"/>
+          <w:szCs w:val="20"/>
+          <w:highlight w:val="cyan"/>
+        </w:rPr>
+        <w:t>The handling mechanism for checked and unchecked exceptions is the same—we can handle both using try-catch, throws, etc. The main difference is that for checked exceptions, the compiler forces us to either handle the exception or declare it using throws. For unchecked exceptions, the compiler does not force us to handle or declare them. If an unchecked exception occurs and is not handled, it propagates at runtime and may eventually be handled by the JVM's uncaught-exception mechanism.</w:t>
+      </w:r>
+    </w:p>
+    <w:p>
+      <w:pPr>
+        <w:jc w:val="both"/>
+        <w:rPr>
+          <w:bCs/>
+          <w:sz w:val="20"/>
+          <w:szCs w:val="20"/>
+        </w:rPr>
+      </w:pPr>
+      <w:r>
+        <w:rPr>
+          <w:bCs/>
+          <w:sz w:val="20"/>
+          <w:szCs w:val="20"/>
+        </w:rPr>
+        <w:t xml:space="preserve">We didn’t get class file if there is unhandled checked exception in program </w:t>
+      </w:r>
     </w:p>
     <w:p>
       <w:pPr>
@@ -22764,7 +23907,6 @@
           <w:sz w:val="28"/>
           <w:szCs w:val="28"/>
         </w:rPr>
-        <w:lastRenderedPageBreak/>
         <w:t>EE = Enterprise Edition</w:t>
       </w:r>
     </w:p>
@@ -23007,6 +24149,7 @@
           <w:sz w:val="28"/>
           <w:szCs w:val="28"/>
         </w:rPr>
+        <w:lastRenderedPageBreak/>
         <w:t>Also called as Jakarta EE.</w:t>
       </w:r>
     </w:p>
@@ -23339,7 +24482,6 @@
           <w:sz w:val="20"/>
           <w:szCs w:val="20"/>
         </w:rPr>
-        <w:lastRenderedPageBreak/>
         <w:t>-</w:t>
       </w:r>
       <w:r>
@@ -24021,6 +25163,7 @@
                 <w:sz w:val="20"/>
                 <w:szCs w:val="20"/>
               </w:rPr>
+              <w:lastRenderedPageBreak/>
               <w:t xml:space="preserve">Used for </w:t>
             </w:r>
             <w:r>
@@ -24158,7 +25301,7 @@
                 <w:szCs w:val="20"/>
               </w:rPr>
               <w:pict w14:anchorId="0F793291">
-                <v:rect id="_x0000_i1053" style="width:0;height:1.5pt" o:hralign="center" o:hrstd="t" o:hr="t" fillcolor="#a0a0a0" stroked="f"/>
+                <v:rect id="_x0000_i1025" style="width:0;height:1.5pt" o:hralign="center" o:hrstd="t" o:hr="t" fillcolor="#a0a0a0" stroked="f"/>
               </w:pict>
             </w:r>
           </w:p>
@@ -24400,7 +25543,7 @@
                 <w:szCs w:val="20"/>
               </w:rPr>
               <w:pict w14:anchorId="3795AD0F">
-                <v:rect id="_x0000_i1054" style="width:0;height:1.5pt" o:hralign="center" o:hrstd="t" o:hr="t" fillcolor="#a0a0a0" stroked="f"/>
+                <v:rect id="_x0000_i1026" style="width:0;height:1.5pt" o:hralign="center" o:hrstd="t" o:hr="t" fillcolor="#a0a0a0" stroked="f"/>
               </w:pict>
             </w:r>
           </w:p>
@@ -24637,7 +25780,7 @@
                 <w:szCs w:val="20"/>
               </w:rPr>
               <w:pict w14:anchorId="041CDDC3">
-                <v:rect id="_x0000_i1055" style="width:0;height:1.5pt" o:hralign="center" o:hrstd="t" o:hr="t" fillcolor="#a0a0a0" stroked="f"/>
+                <v:rect id="_x0000_i1027" style="width:0;height:1.5pt" o:hralign="center" o:hrstd="t" o:hr="t" fillcolor="#a0a0a0" stroked="f"/>
               </w:pict>
             </w:r>
           </w:p>
@@ -24868,6 +26011,7 @@
                 <w:sz w:val="20"/>
                 <w:szCs w:val="20"/>
               </w:rPr>
+              <w:lastRenderedPageBreak/>
               <w:t>5. Consumer&lt;T&gt;</w:t>
             </w:r>
           </w:p>
@@ -24952,6 +26096,7 @@
                 <w:sz w:val="20"/>
                 <w:szCs w:val="20"/>
               </w:rPr>
+              <w:lastRenderedPageBreak/>
               <w:t xml:space="preserve">Used when you want to </w:t>
             </w:r>
             <w:r>
@@ -25097,7 +26242,7 @@
                 <w:szCs w:val="20"/>
               </w:rPr>
               <w:pict w14:anchorId="57A9BCE3">
-                <v:rect id="_x0000_i1056" style="width:0;height:1.5pt" o:hralign="center" o:hrstd="t" o:hr="t" fillcolor="#a0a0a0" stroked="f"/>
+                <v:rect id="_x0000_i1028" style="width:0;height:1.5pt" o:hralign="center" o:hrstd="t" o:hr="t" fillcolor="#a0a0a0" stroked="f"/>
               </w:pict>
             </w:r>
           </w:p>
@@ -25384,7 +26529,7 @@
                 <w:szCs w:val="20"/>
               </w:rPr>
               <w:pict w14:anchorId="25C03073">
-                <v:rect id="_x0000_i1057" style="width:0;height:1.5pt" o:hralign="center" o:hrstd="t" o:hr="t" fillcolor="#a0a0a0" stroked="f"/>
+                <v:rect id="_x0000_i1029" style="width:0;height:1.5pt" o:hralign="center" o:hrstd="t" o:hr="t" fillcolor="#a0a0a0" stroked="f"/>
               </w:pict>
             </w:r>
           </w:p>
@@ -25875,7 +27020,6 @@
           <w:sz w:val="20"/>
           <w:szCs w:val="20"/>
         </w:rPr>
-        <w:lastRenderedPageBreak/>
         <w:t xml:space="preserve">For each excepts consumer </w:t>
       </w:r>
     </w:p>
@@ -26483,6 +27627,7 @@
           <w:sz w:val="20"/>
           <w:szCs w:val="20"/>
         </w:rPr>
+        <w:lastRenderedPageBreak/>
         <w:t>list.forEach</w:t>
       </w:r>
       <w:proofErr w:type="spellEnd"/>
@@ -26656,7 +27801,7 @@
           <w:szCs w:val="20"/>
         </w:rPr>
         <w:pict w14:anchorId="5D55C4E9">
-          <v:rect id="_x0000_i1058" style="width:0;height:1.5pt" o:hralign="center" o:hrstd="t" o:hr="t" fillcolor="#a0a0a0" stroked="f"/>
+          <v:rect id="_x0000_i1030" style="width:0;height:1.5pt" o:hralign="center" o:hrstd="t" o:hr="t" fillcolor="#a0a0a0" stroked="f"/>
         </w:pict>
       </w:r>
     </w:p>
@@ -26904,7 +28049,7 @@
           <w:szCs w:val="20"/>
         </w:rPr>
         <w:pict w14:anchorId="3E700466">
-          <v:rect id="_x0000_i1059" style="width:0;height:1.5pt" o:hralign="center" o:hrstd="t" o:hr="t" fillcolor="#a0a0a0" stroked="f"/>
+          <v:rect id="_x0000_i1031" style="width:0;height:1.5pt" o:hralign="center" o:hrstd="t" o:hr="t" fillcolor="#a0a0a0" stroked="f"/>
         </w:pict>
       </w:r>
     </w:p>
@@ -27204,7 +28349,6 @@
                 <w:sz w:val="20"/>
                 <w:szCs w:val="20"/>
               </w:rPr>
-              <w:lastRenderedPageBreak/>
               <w:t>Particular object's instance method</w:t>
             </w:r>
           </w:p>
@@ -27856,6 +29000,7 @@
                 <w:sz w:val="20"/>
                 <w:szCs w:val="20"/>
               </w:rPr>
+              <w:lastRenderedPageBreak/>
               <w:t>Static method reference</w:t>
             </w:r>
           </w:p>
@@ -28393,7 +29538,6 @@
                 <w:sz w:val="20"/>
                 <w:szCs w:val="20"/>
               </w:rPr>
-              <w:lastRenderedPageBreak/>
               <w:t xml:space="preserve">Function&lt;String, Integer&gt; f = s -&gt; </w:t>
             </w:r>
             <w:proofErr w:type="spellStart"/>
@@ -29037,6 +30181,7 @@
                 <w:sz w:val="20"/>
                 <w:szCs w:val="20"/>
               </w:rPr>
+              <w:lastRenderedPageBreak/>
               <w:t>Here:</w:t>
             </w:r>
           </w:p>
@@ -29524,7 +30669,6 @@
                 <w:sz w:val="20"/>
                 <w:szCs w:val="20"/>
               </w:rPr>
-              <w:lastRenderedPageBreak/>
               <w:t>Example</w:t>
             </w:r>
           </w:p>
@@ -30002,6 +31146,7 @@
           <w:sz w:val="20"/>
           <w:szCs w:val="20"/>
         </w:rPr>
+        <w:lastRenderedPageBreak/>
         <w:t>Particular Object</w:t>
       </w:r>
     </w:p>
@@ -30828,7 +31973,6 @@
                 <w:sz w:val="20"/>
                 <w:szCs w:val="20"/>
               </w:rPr>
-              <w:lastRenderedPageBreak/>
               <w:t xml:space="preserve">s -&gt; </w:t>
             </w:r>
             <w:proofErr w:type="spellStart"/>
@@ -31476,6 +32620,7 @@
           <w:sz w:val="20"/>
           <w:szCs w:val="20"/>
         </w:rPr>
+        <w:lastRenderedPageBreak/>
         <w:t>ClassName</w:t>
       </w:r>
       <w:proofErr w:type="spellEnd"/>
@@ -37181,6 +38326,15 @@
       <w:szCs w:val="20"/>
     </w:rPr>
   </w:style>
+  <w:style w:type="paragraph" w:styleId="NoSpacing">
+    <w:name w:val="No Spacing"/>
+    <w:uiPriority w:val="1"/>
+    <w:qFormat/>
+    <w:rsid w:val="000E7D2B"/>
+    <w:pPr>
+      <w:spacing w:after="0" w:line="240" w:lineRule="auto"/>
+    </w:pPr>
+  </w:style>
 </w:styles>
 </file>
 

</xml_diff>